<commit_message>
fix(lung): map optional historical fields without inferring results
</commit_message>
<xml_diff>
--- a/panels/lung_13/templates/lung_13_historical_draft_v1.docx
+++ b/panels/lung_13/templates/lung_13_historical_draft_v1.docx
@@ -4215,6 +4215,20 @@
       </w:r>
       <w:bookmarkEnd w:id="14"/>
       <w:bookmarkEnd w:id="15"/>
+    </w:p>
+    <w:p>
+      <w:pPr>
+        <w:keepNext w:val="0"/>
+        <w:spacing w:after="120"/>
+      </w:pPr>
+      <w:r>
+        <w:rPr>
+          <w:rFonts w:ascii="微软雅黑" w:hAnsi="微软雅黑" w:eastAsia="微软雅黑"/>
+          <w:b w:val="0"/>
+          <w:sz w:val="21"/>
+        </w:rPr>
+        <w:t>本次检出体细胞变异：{{ total_variants_count }} 个（含Ⅰ/Ⅱ/Ⅲ类）；靶向药物相关变异：{{ drug_related_count }} 个。</w:t>
+      </w:r>
     </w:p>
     <w:tbl>
       <w:tblPr>

</xml_diff>